<commit_message>
sprint 1, validacion, graficos de avance y control
</commit_message>
<xml_diff>
--- a/FASE 2/Evidencias Proyecto/Evidencias de documentación/Sprint 1/Documento_validando_Sprint_1.docx
+++ b/FASE 2/Evidencias Proyecto/Evidencias de documentación/Sprint 1/Documento_validando_Sprint_1.docx
@@ -215,40 +215,7 @@
           <w:szCs w:val="48"/>
           <w:lang w:val="en-US" w:eastAsia="es-VE"/>
         </w:rPr>
-        <w:t xml:space="preserve"> </w:t>
-      </w:r>
-      <w:r>
-        <w:rPr>
-          <w:rFonts w:eastAsia="Times New Roman" w:cs="Arial"/>
-          <w:b/>
-          <w:color w:val="000000"/>
-          <w:sz w:val="48"/>
-          <w:szCs w:val="48"/>
-          <w:lang w:eastAsia="es-VE"/>
-        </w:rPr>
-        <w:t>“</w:t>
-      </w:r>
-      <w:r>
-        <w:rPr>
-          <w:rFonts w:eastAsia="Times New Roman" w:cs="Arial"/>
-          <w:b/>
-          <w:color w:val="000000"/>
-          <w:sz w:val="48"/>
-          <w:szCs w:val="48"/>
-          <w:lang w:eastAsia="es-VE"/>
-        </w:rPr>
-        <w:t>Nombre</w:t>
-      </w:r>
-      <w:r>
-        <w:rPr>
-          <w:rFonts w:eastAsia="Times New Roman" w:cs="Arial"/>
-          <w:b/>
-          <w:color w:val="000000"/>
-          <w:sz w:val="48"/>
-          <w:szCs w:val="48"/>
-          <w:lang w:eastAsia="es-VE"/>
-        </w:rPr>
-        <w:t xml:space="preserve"> Proyecto”</w:t>
+        <w:t xml:space="preserve">“FitSearch”</w:t>
       </w:r>
     </w:p>
     <w:p>
@@ -272,29 +239,7 @@
           <w:sz w:val="36"/>
           <w:szCs w:val="36"/>
         </w:rPr>
-        <w:t>[</w:t>
-      </w:r>
-      <w:r>
-        <w:rPr>
-          <w:rFonts w:ascii="Calibri" w:hAnsi="Calibri"/>
-          <w:b/>
-          <w:i/>
-          <w:color w:val="00B050"/>
-          <w:sz w:val="36"/>
-          <w:szCs w:val="36"/>
-        </w:rPr>
-        <w:t>Siglas</w:t>
-      </w:r>
-      <w:r>
-        <w:rPr>
-          <w:rFonts w:ascii="Calibri" w:hAnsi="Calibri"/>
-          <w:b/>
-          <w:i/>
-          <w:color w:val="00B050"/>
-          <w:sz w:val="36"/>
-          <w:szCs w:val="36"/>
-        </w:rPr>
-        <w:t xml:space="preserve"> del Proyecto]</w:t>
+        <w:t xml:space="preserve">Sprint 1 — semanas 5 y 6</w:t>
       </w:r>
     </w:p>
     <w:p>
@@ -317,62 +262,12 @@
           <w:sz w:val="36"/>
           <w:szCs w:val="36"/>
         </w:rPr>
-        <w:t>Fecha:</w:t>
-      </w:r>
-      <w:r>
-        <w:rPr>
-          <w:b/>
-          <w:i/>
-          <w:color w:val="00B050"/>
-          <w:sz w:val="36"/>
-          <w:szCs w:val="36"/>
-        </w:rPr>
-        <w:t>[</w:t>
+        <w:t xml:space="preserve">Fecha: 21-09-2026</w:t>
       </w:r>
       <w:proofErr w:type="spellStart"/>
-      <w:r>
-        <w:rPr>
-          <w:b/>
-          <w:i/>
-          <w:color w:val="00B050"/>
-          <w:sz w:val="36"/>
-          <w:szCs w:val="36"/>
-        </w:rPr>
-        <w:t>dd</w:t>
-      </w:r>
       <w:proofErr w:type="spellEnd"/>
-      <w:r>
-        <w:rPr>
-          <w:b/>
-          <w:i/>
-          <w:color w:val="00B050"/>
-          <w:sz w:val="36"/>
-          <w:szCs w:val="36"/>
-        </w:rPr>
-        <w:t>/mm/</w:t>
-      </w:r>
       <w:proofErr w:type="spellStart"/>
-      <w:r>
-        <w:rPr>
-          <w:b/>
-          <w:i/>
-          <w:color w:val="00B050"/>
-          <w:sz w:val="36"/>
-          <w:szCs w:val="36"/>
-        </w:rPr>
-        <w:t>aaa</w:t>
-      </w:r>
       <w:proofErr w:type="spellEnd"/>
-      <w:r>
-        <w:rPr>
-          <w:b/>
-          <w:i/>
-          <w:color w:val="00B050"/>
-          <w:sz w:val="36"/>
-          <w:szCs w:val="36"/>
-        </w:rPr>
-        <w:t>]</w:t>
-      </w:r>
     </w:p>
     <w:p>
       <w:pPr>
@@ -1346,6 +1241,9 @@
                 <w:szCs w:val="24"/>
               </w:rPr>
             </w:pPr>
+            <w:r>
+              <w:t>1.1</w:t>
+            </w:r>
           </w:p>
         </w:tc>
         <w:tc>
@@ -1364,6 +1262,9 @@
                 <w:szCs w:val="24"/>
               </w:rPr>
             </w:pPr>
+            <w:r>
+              <w:t>21-09-2026</w:t>
+            </w:r>
           </w:p>
         </w:tc>
         <w:tc>
@@ -1382,6 +1283,9 @@
                 <w:szCs w:val="24"/>
               </w:rPr>
             </w:pPr>
+            <w:r>
+              <w:t>Registro de avances día a día, gráfico de avance y pila del producto actualizada</w:t>
+            </w:r>
           </w:p>
         </w:tc>
         <w:tc>
@@ -1400,6 +1304,9 @@
                 <w:szCs w:val="24"/>
               </w:rPr>
             </w:pPr>
+            <w:r>
+              <w:t>Rodrigo Cárcamo Rojas</w:t>
+            </w:r>
           </w:p>
         </w:tc>
       </w:tr>
@@ -2783,7 +2690,7 @@
                 <w:b/>
                 <w:bCs/>
               </w:rPr>
-              <w:t>1</w:t>
+              <w:t xml:space="preserve">6</w:t>
             </w:r>
           </w:p>
         </w:tc>
@@ -2804,7 +2711,7 @@
                 <w:b/>
                 <w:bCs/>
               </w:rPr>
-              <w:t>2</w:t>
+              <w:t xml:space="preserve">7</w:t>
             </w:r>
           </w:p>
         </w:tc>
@@ -2825,7 +2732,7 @@
                 <w:b/>
                 <w:bCs/>
               </w:rPr>
-              <w:t>3</w:t>
+              <w:t xml:space="preserve">8</w:t>
             </w:r>
           </w:p>
         </w:tc>
@@ -2846,7 +2753,7 @@
                 <w:b/>
                 <w:bCs/>
               </w:rPr>
-              <w:t>4</w:t>
+              <w:t xml:space="preserve"/>
             </w:r>
           </w:p>
         </w:tc>
@@ -2867,7 +2774,7 @@
                 <w:b/>
                 <w:bCs/>
               </w:rPr>
-              <w:t>5</w:t>
+              <w:t xml:space="preserve"/>
             </w:r>
           </w:p>
         </w:tc>
@@ -2925,9 +2832,9 @@
                 <w:rFonts w:ascii="Calibri" w:hAnsi="Calibri"/>
                 <w:i/>
                 <w:color w:val="545454"/>
-                <w:sz w:val="19"/>
-              </w:rPr>
-              <w:t>[Esta tabla se completa día a día durante la ejecución real del Sprint 1, con las horas efectivamente trabajadas por cada integrante.]</w:t>
+                <w:sz w:val="16"/>
+              </w:rPr>
+              <w:t xml:space="preserve">FS-HU-01</w:t>
             </w:r>
           </w:p>
         </w:tc>
@@ -2935,61 +2842,128 @@
           <w:tcPr>
             <w:tcW w:w="1756" w:type="dxa"/>
           </w:tcPr>
-          <w:p/>
+          <w:p>
+            <w:r>
+              <w:rPr>
+                <w:sz w:val="16"/>
+              </w:rPr>
+              <w:t>Configurar proyecto backend Node.js/Express y conexión a MySQL</w:t>
+            </w:r>
+          </w:p>
         </w:tc>
         <w:tc>
           <w:tcPr>
             <w:tcW w:w="1275" w:type="dxa"/>
           </w:tcPr>
-          <w:p/>
+          <w:p>
+            <w:r>
+              <w:rPr>
+                <w:sz w:val="16"/>
+              </w:rPr>
+              <w:t>4</w:t>
+            </w:r>
+          </w:p>
         </w:tc>
         <w:tc>
           <w:tcPr>
             <w:tcW w:w="1560" w:type="dxa"/>
           </w:tcPr>
-          <w:p/>
+          <w:p>
+            <w:r>
+              <w:rPr>
+                <w:sz w:val="16"/>
+              </w:rPr>
+              <w:t>Luis Méndez</w:t>
+            </w:r>
+          </w:p>
         </w:tc>
         <w:tc>
           <w:tcPr>
             <w:tcW w:w="567" w:type="dxa"/>
           </w:tcPr>
-          <w:p/>
+          <w:p>
+            <w:r>
+              <w:rPr>
+                <w:sz w:val="16"/>
+              </w:rPr>
+              <w:t>2</w:t>
+            </w:r>
+          </w:p>
         </w:tc>
         <w:tc>
           <w:tcPr>
             <w:tcW w:w="567" w:type="dxa"/>
           </w:tcPr>
-          <w:p/>
+          <w:p>
+            <w:r>
+              <w:rPr>
+                <w:sz w:val="16"/>
+              </w:rPr>
+              <w:t>2</w:t>
+            </w:r>
+          </w:p>
         </w:tc>
         <w:tc>
           <w:tcPr>
             <w:tcW w:w="425" w:type="dxa"/>
           </w:tcPr>
-          <w:p/>
+          <w:p>
+            <w:r>
+              <w:rPr>
+                <w:sz w:val="16"/>
+              </w:rPr>
+              <w:t>-</w:t>
+            </w:r>
+          </w:p>
         </w:tc>
         <w:tc>
           <w:tcPr>
             <w:tcW w:w="425" w:type="dxa"/>
           </w:tcPr>
-          <w:p/>
+          <w:p>
+            <w:r>
+              <w:rPr>
+                <w:sz w:val="16"/>
+              </w:rPr>
+            </w:r>
+          </w:p>
         </w:tc>
         <w:tc>
           <w:tcPr>
             <w:tcW w:w="425" w:type="dxa"/>
           </w:tcPr>
-          <w:p/>
+          <w:p>
+            <w:r>
+              <w:rPr>
+                <w:sz w:val="16"/>
+              </w:rPr>
+            </w:r>
+          </w:p>
         </w:tc>
         <w:tc>
           <w:tcPr>
             <w:tcW w:w="792" w:type="dxa"/>
           </w:tcPr>
-          <w:p/>
+          <w:p>
+            <w:r>
+              <w:rPr>
+                <w:sz w:val="16"/>
+              </w:rPr>
+              <w:t>4</w:t>
+            </w:r>
+          </w:p>
         </w:tc>
         <w:tc>
           <w:tcPr>
             <w:tcW w:w="993" w:type="dxa"/>
           </w:tcPr>
-          <w:p/>
+          <w:p>
+            <w:r>
+              <w:rPr>
+                <w:sz w:val="16"/>
+              </w:rPr>
+            </w:r>
+          </w:p>
         </w:tc>
       </w:tr>
       <w:tr>
@@ -2997,67 +2971,141 @@
           <w:tcPr>
             <w:tcW w:w="1042" w:type="dxa"/>
           </w:tcPr>
-          <w:p/>
+          <w:p>
+            <w:r>
+              <w:rPr>
+                <w:sz w:val="16"/>
+              </w:rPr>
+              <w:t>FS-HU-01</w:t>
+            </w:r>
+          </w:p>
         </w:tc>
         <w:tc>
           <w:tcPr>
             <w:tcW w:w="1756" w:type="dxa"/>
           </w:tcPr>
-          <w:p/>
+          <w:p>
+            <w:r>
+              <w:rPr>
+                <w:sz w:val="16"/>
+              </w:rPr>
+              <w:t>Implementar endpoints de registro, login y logout (JWT y hash de contraseña)</w:t>
+            </w:r>
+          </w:p>
         </w:tc>
         <w:tc>
           <w:tcPr>
             <w:tcW w:w="1275" w:type="dxa"/>
           </w:tcPr>
-          <w:p/>
+          <w:p>
+            <w:r>
+              <w:rPr>
+                <w:sz w:val="16"/>
+              </w:rPr>
+              <w:t>7</w:t>
+            </w:r>
+          </w:p>
         </w:tc>
         <w:tc>
           <w:tcPr>
             <w:tcW w:w="1560" w:type="dxa"/>
           </w:tcPr>
-          <w:p/>
+          <w:p>
+            <w:r>
+              <w:rPr>
+                <w:sz w:val="16"/>
+              </w:rPr>
+              <w:t>Luis Méndez</w:t>
+            </w:r>
+          </w:p>
         </w:tc>
         <w:tc>
           <w:tcPr>
             <w:tcW w:w="567" w:type="dxa"/>
           </w:tcPr>
-          <w:p/>
+          <w:p>
+            <w:r>
+              <w:rPr>
+                <w:sz w:val="16"/>
+              </w:rPr>
+              <w:t>-</w:t>
+            </w:r>
+          </w:p>
         </w:tc>
         <w:tc>
           <w:tcPr>
             <w:tcW w:w="567" w:type="dxa"/>
           </w:tcPr>
-          <w:p/>
+          <w:p>
+            <w:r>
+              <w:rPr>
+                <w:sz w:val="16"/>
+              </w:rPr>
+              <w:t>4</w:t>
+            </w:r>
+          </w:p>
         </w:tc>
         <w:tc>
           <w:tcPr>
             <w:tcW w:w="425" w:type="dxa"/>
           </w:tcPr>
-          <w:p/>
+          <w:p>
+            <w:r>
+              <w:rPr>
+                <w:sz w:val="16"/>
+              </w:rPr>
+              <w:t>3</w:t>
+            </w:r>
+          </w:p>
         </w:tc>
         <w:tc>
           <w:tcPr>
             <w:tcW w:w="425" w:type="dxa"/>
           </w:tcPr>
-          <w:p/>
+          <w:p>
+            <w:r>
+              <w:rPr>
+                <w:sz w:val="16"/>
+              </w:rPr>
+            </w:r>
+          </w:p>
         </w:tc>
         <w:tc>
           <w:tcPr>
             <w:tcW w:w="425" w:type="dxa"/>
           </w:tcPr>
-          <w:p/>
+          <w:p>
+            <w:r>
+              <w:rPr>
+                <w:sz w:val="16"/>
+              </w:rPr>
+            </w:r>
+          </w:p>
         </w:tc>
         <w:tc>
           <w:tcPr>
             <w:tcW w:w="792" w:type="dxa"/>
           </w:tcPr>
-          <w:p/>
+          <w:p>
+            <w:r>
+              <w:rPr>
+                <w:sz w:val="16"/>
+              </w:rPr>
+              <w:t>7</w:t>
+            </w:r>
+          </w:p>
         </w:tc>
         <w:tc>
           <w:tcPr>
             <w:tcW w:w="993" w:type="dxa"/>
           </w:tcPr>
-          <w:p/>
+          <w:p>
+            <w:r>
+              <w:rPr>
+                <w:sz w:val="16"/>
+              </w:rPr>
+            </w:r>
+          </w:p>
         </w:tc>
       </w:tr>
       <w:tr>
@@ -3065,67 +3113,141 @@
           <w:tcPr>
             <w:tcW w:w="1042" w:type="dxa"/>
           </w:tcPr>
-          <w:p/>
+          <w:p>
+            <w:r>
+              <w:rPr>
+                <w:sz w:val="16"/>
+              </w:rPr>
+              <w:t>FS-HU-01</w:t>
+            </w:r>
+          </w:p>
         </w:tc>
         <w:tc>
           <w:tcPr>
             <w:tcW w:w="1756" w:type="dxa"/>
           </w:tcPr>
-          <w:p/>
+          <w:p>
+            <w:r>
+              <w:rPr>
+                <w:sz w:val="16"/>
+              </w:rPr>
+              <w:t>Construir pantallas de registro e inicio de sesión (Frontend)</w:t>
+            </w:r>
+          </w:p>
         </w:tc>
         <w:tc>
           <w:tcPr>
             <w:tcW w:w="1275" w:type="dxa"/>
           </w:tcPr>
-          <w:p/>
+          <w:p>
+            <w:r>
+              <w:rPr>
+                <w:sz w:val="16"/>
+              </w:rPr>
+              <w:t>6</w:t>
+            </w:r>
+          </w:p>
         </w:tc>
         <w:tc>
           <w:tcPr>
             <w:tcW w:w="1560" w:type="dxa"/>
           </w:tcPr>
-          <w:p/>
+          <w:p>
+            <w:r>
+              <w:rPr>
+                <w:sz w:val="16"/>
+              </w:rPr>
+              <w:t>Nicolás Silva</w:t>
+            </w:r>
+          </w:p>
         </w:tc>
         <w:tc>
           <w:tcPr>
             <w:tcW w:w="567" w:type="dxa"/>
           </w:tcPr>
-          <w:p/>
+          <w:p>
+            <w:r>
+              <w:rPr>
+                <w:sz w:val="16"/>
+              </w:rPr>
+              <w:t>2</w:t>
+            </w:r>
+          </w:p>
         </w:tc>
         <w:tc>
           <w:tcPr>
             <w:tcW w:w="567" w:type="dxa"/>
           </w:tcPr>
-          <w:p/>
+          <w:p>
+            <w:r>
+              <w:rPr>
+                <w:sz w:val="16"/>
+              </w:rPr>
+              <w:t>2</w:t>
+            </w:r>
+          </w:p>
         </w:tc>
         <w:tc>
           <w:tcPr>
             <w:tcW w:w="425" w:type="dxa"/>
           </w:tcPr>
-          <w:p/>
+          <w:p>
+            <w:r>
+              <w:rPr>
+                <w:sz w:val="16"/>
+              </w:rPr>
+              <w:t>2</w:t>
+            </w:r>
+          </w:p>
         </w:tc>
         <w:tc>
           <w:tcPr>
             <w:tcW w:w="425" w:type="dxa"/>
           </w:tcPr>
-          <w:p/>
+          <w:p>
+            <w:r>
+              <w:rPr>
+                <w:sz w:val="16"/>
+              </w:rPr>
+            </w:r>
+          </w:p>
         </w:tc>
         <w:tc>
           <w:tcPr>
             <w:tcW w:w="425" w:type="dxa"/>
           </w:tcPr>
-          <w:p/>
+          <w:p>
+            <w:r>
+              <w:rPr>
+                <w:sz w:val="16"/>
+              </w:rPr>
+            </w:r>
+          </w:p>
         </w:tc>
         <w:tc>
           <w:tcPr>
             <w:tcW w:w="792" w:type="dxa"/>
           </w:tcPr>
-          <w:p/>
+          <w:p>
+            <w:r>
+              <w:rPr>
+                <w:sz w:val="16"/>
+              </w:rPr>
+              <w:t>6</w:t>
+            </w:r>
+          </w:p>
         </w:tc>
         <w:tc>
           <w:tcPr>
             <w:tcW w:w="993" w:type="dxa"/>
           </w:tcPr>
-          <w:p/>
+          <w:p>
+            <w:r>
+              <w:rPr>
+                <w:sz w:val="16"/>
+              </w:rPr>
+            </w:r>
+          </w:p>
         </w:tc>
       </w:tr>
       <w:tr>
@@ -3133,67 +3255,141 @@
           <w:tcPr>
             <w:tcW w:w="1042" w:type="dxa"/>
           </w:tcPr>
-          <w:p/>
+          <w:p>
+            <w:r>
+              <w:rPr>
+                <w:sz w:val="16"/>
+              </w:rPr>
+              <w:t>FS-HU-01</w:t>
+            </w:r>
+          </w:p>
         </w:tc>
         <w:tc>
           <w:tcPr>
             <w:tcW w:w="1756" w:type="dxa"/>
           </w:tcPr>
-          <w:p/>
+          <w:p>
+            <w:r>
+              <w:rPr>
+                <w:sz w:val="16"/>
+              </w:rPr>
+              <w:t>Pruebas manuales de registro y login</w:t>
+            </w:r>
+          </w:p>
         </w:tc>
         <w:tc>
           <w:tcPr>
             <w:tcW w:w="1275" w:type="dxa"/>
           </w:tcPr>
-          <w:p/>
+          <w:p>
+            <w:r>
+              <w:rPr>
+                <w:sz w:val="16"/>
+              </w:rPr>
+              <w:t>2</w:t>
+            </w:r>
+          </w:p>
         </w:tc>
         <w:tc>
           <w:tcPr>
             <w:tcW w:w="1560" w:type="dxa"/>
           </w:tcPr>
-          <w:p/>
+          <w:p>
+            <w:r>
+              <w:rPr>
+                <w:sz w:val="16"/>
+              </w:rPr>
+              <w:t>Nicolás Silva</w:t>
+            </w:r>
+          </w:p>
         </w:tc>
         <w:tc>
           <w:tcPr>
             <w:tcW w:w="567" w:type="dxa"/>
           </w:tcPr>
-          <w:p/>
+          <w:p>
+            <w:r>
+              <w:rPr>
+                <w:sz w:val="16"/>
+              </w:rPr>
+              <w:t>-</w:t>
+            </w:r>
+          </w:p>
         </w:tc>
         <w:tc>
           <w:tcPr>
             <w:tcW w:w="567" w:type="dxa"/>
           </w:tcPr>
-          <w:p/>
+          <w:p>
+            <w:r>
+              <w:rPr>
+                <w:sz w:val="16"/>
+              </w:rPr>
+              <w:t>-</w:t>
+            </w:r>
+          </w:p>
         </w:tc>
         <w:tc>
           <w:tcPr>
             <w:tcW w:w="425" w:type="dxa"/>
           </w:tcPr>
-          <w:p/>
+          <w:p>
+            <w:r>
+              <w:rPr>
+                <w:sz w:val="16"/>
+              </w:rPr>
+              <w:t>2</w:t>
+            </w:r>
+          </w:p>
         </w:tc>
         <w:tc>
           <w:tcPr>
             <w:tcW w:w="425" w:type="dxa"/>
           </w:tcPr>
-          <w:p/>
+          <w:p>
+            <w:r>
+              <w:rPr>
+                <w:sz w:val="16"/>
+              </w:rPr>
+            </w:r>
+          </w:p>
         </w:tc>
         <w:tc>
           <w:tcPr>
             <w:tcW w:w="425" w:type="dxa"/>
           </w:tcPr>
-          <w:p/>
+          <w:p>
+            <w:r>
+              <w:rPr>
+                <w:sz w:val="16"/>
+              </w:rPr>
+            </w:r>
+          </w:p>
         </w:tc>
         <w:tc>
           <w:tcPr>
             <w:tcW w:w="792" w:type="dxa"/>
           </w:tcPr>
-          <w:p/>
+          <w:p>
+            <w:r>
+              <w:rPr>
+                <w:sz w:val="16"/>
+              </w:rPr>
+              <w:t>2</w:t>
+            </w:r>
+          </w:p>
         </w:tc>
         <w:tc>
           <w:tcPr>
             <w:tcW w:w="993" w:type="dxa"/>
           </w:tcPr>
-          <w:p/>
+          <w:p>
+            <w:r>
+              <w:rPr>
+                <w:sz w:val="16"/>
+              </w:rPr>
+            </w:r>
+          </w:p>
         </w:tc>
       </w:tr>
       <w:tr>
@@ -3201,67 +3397,141 @@
           <w:tcPr>
             <w:tcW w:w="1042" w:type="dxa"/>
           </w:tcPr>
-          <w:p/>
+          <w:p>
+            <w:r>
+              <w:rPr>
+                <w:sz w:val="16"/>
+              </w:rPr>
+              <w:t>FS-HU-01</w:t>
+            </w:r>
+          </w:p>
         </w:tc>
         <w:tc>
           <w:tcPr>
             <w:tcW w:w="1756" w:type="dxa"/>
           </w:tcPr>
-          <w:p/>
+          <w:p>
+            <w:r>
+              <w:rPr>
+                <w:sz w:val="16"/>
+              </w:rPr>
+              <w:t>Pruebas automatizadas de autenticación (Jest y Supertest)</w:t>
+            </w:r>
+          </w:p>
         </w:tc>
         <w:tc>
           <w:tcPr>
             <w:tcW w:w="1275" w:type="dxa"/>
           </w:tcPr>
-          <w:p/>
+          <w:p>
+            <w:r>
+              <w:rPr>
+                <w:sz w:val="16"/>
+              </w:rPr>
+              <w:t>3</w:t>
+            </w:r>
+          </w:p>
         </w:tc>
         <w:tc>
           <w:tcPr>
             <w:tcW w:w="1560" w:type="dxa"/>
           </w:tcPr>
-          <w:p/>
+          <w:p>
+            <w:r>
+              <w:rPr>
+                <w:sz w:val="16"/>
+              </w:rPr>
+              <w:t>Rodrigo Cárcamo Rojas</w:t>
+            </w:r>
+          </w:p>
         </w:tc>
         <w:tc>
           <w:tcPr>
             <w:tcW w:w="567" w:type="dxa"/>
           </w:tcPr>
-          <w:p/>
+          <w:p>
+            <w:r>
+              <w:rPr>
+                <w:sz w:val="16"/>
+              </w:rPr>
+              <w:t>1</w:t>
+            </w:r>
+          </w:p>
         </w:tc>
         <w:tc>
           <w:tcPr>
             <w:tcW w:w="567" w:type="dxa"/>
           </w:tcPr>
-          <w:p/>
+          <w:p>
+            <w:r>
+              <w:rPr>
+                <w:sz w:val="16"/>
+              </w:rPr>
+              <w:t>2</w:t>
+            </w:r>
+          </w:p>
         </w:tc>
         <w:tc>
           <w:tcPr>
             <w:tcW w:w="425" w:type="dxa"/>
           </w:tcPr>
-          <w:p/>
+          <w:p>
+            <w:r>
+              <w:rPr>
+                <w:sz w:val="16"/>
+              </w:rPr>
+              <w:t>-</w:t>
+            </w:r>
+          </w:p>
         </w:tc>
         <w:tc>
           <w:tcPr>
             <w:tcW w:w="425" w:type="dxa"/>
           </w:tcPr>
-          <w:p/>
+          <w:p>
+            <w:r>
+              <w:rPr>
+                <w:sz w:val="16"/>
+              </w:rPr>
+            </w:r>
+          </w:p>
         </w:tc>
         <w:tc>
           <w:tcPr>
             <w:tcW w:w="425" w:type="dxa"/>
           </w:tcPr>
-          <w:p/>
+          <w:p>
+            <w:r>
+              <w:rPr>
+                <w:sz w:val="16"/>
+              </w:rPr>
+            </w:r>
+          </w:p>
         </w:tc>
         <w:tc>
           <w:tcPr>
             <w:tcW w:w="792" w:type="dxa"/>
           </w:tcPr>
-          <w:p/>
+          <w:p>
+            <w:r>
+              <w:rPr>
+                <w:sz w:val="16"/>
+              </w:rPr>
+              <w:t>3</w:t>
+            </w:r>
+          </w:p>
         </w:tc>
         <w:tc>
           <w:tcPr>
             <w:tcW w:w="993" w:type="dxa"/>
           </w:tcPr>
-          <w:p/>
+          <w:p>
+            <w:r>
+              <w:rPr>
+                <w:sz w:val="16"/>
+              </w:rPr>
+            </w:r>
+          </w:p>
         </w:tc>
       </w:tr>
       <w:tr>
@@ -3269,67 +3539,141 @@
           <w:tcPr>
             <w:tcW w:w="1042" w:type="dxa"/>
           </w:tcPr>
-          <w:p/>
+          <w:p>
+            <w:r>
+              <w:rPr>
+                <w:sz w:val="16"/>
+              </w:rPr>
+              <w:t>FS-HU-02</w:t>
+            </w:r>
+          </w:p>
         </w:tc>
         <w:tc>
           <w:tcPr>
             <w:tcW w:w="1756" w:type="dxa"/>
           </w:tcPr>
-          <w:p/>
+          <w:p>
+            <w:r>
+              <w:rPr>
+                <w:sz w:val="16"/>
+              </w:rPr>
+              <w:t>Diseñar el diagrama entidad-relación del proyecto</w:t>
+            </w:r>
+          </w:p>
         </w:tc>
         <w:tc>
           <w:tcPr>
             <w:tcW w:w="1275" w:type="dxa"/>
           </w:tcPr>
-          <w:p/>
+          <w:p>
+            <w:r>
+              <w:rPr>
+                <w:sz w:val="16"/>
+              </w:rPr>
+              <w:t>6</w:t>
+            </w:r>
+          </w:p>
         </w:tc>
         <w:tc>
           <w:tcPr>
             <w:tcW w:w="1560" w:type="dxa"/>
           </w:tcPr>
-          <w:p/>
+          <w:p>
+            <w:r>
+              <w:rPr>
+                <w:sz w:val="16"/>
+              </w:rPr>
+              <w:t>Rodrigo Cárcamo Rojas</w:t>
+            </w:r>
+          </w:p>
         </w:tc>
         <w:tc>
           <w:tcPr>
             <w:tcW w:w="567" w:type="dxa"/>
           </w:tcPr>
-          <w:p/>
+          <w:p>
+            <w:r>
+              <w:rPr>
+                <w:sz w:val="16"/>
+              </w:rPr>
+              <w:t>-</w:t>
+            </w:r>
+          </w:p>
         </w:tc>
         <w:tc>
           <w:tcPr>
             <w:tcW w:w="567" w:type="dxa"/>
           </w:tcPr>
-          <w:p/>
+          <w:p>
+            <w:r>
+              <w:rPr>
+                <w:sz w:val="16"/>
+              </w:rPr>
+              <w:t>-</w:t>
+            </w:r>
+          </w:p>
         </w:tc>
         <w:tc>
           <w:tcPr>
             <w:tcW w:w="425" w:type="dxa"/>
           </w:tcPr>
-          <w:p/>
+          <w:p>
+            <w:r>
+              <w:rPr>
+                <w:sz w:val="16"/>
+              </w:rPr>
+              <w:t>6</w:t>
+            </w:r>
+          </w:p>
         </w:tc>
         <w:tc>
           <w:tcPr>
             <w:tcW w:w="425" w:type="dxa"/>
           </w:tcPr>
-          <w:p/>
+          <w:p>
+            <w:r>
+              <w:rPr>
+                <w:sz w:val="16"/>
+              </w:rPr>
+            </w:r>
+          </w:p>
         </w:tc>
         <w:tc>
           <w:tcPr>
             <w:tcW w:w="425" w:type="dxa"/>
           </w:tcPr>
-          <w:p/>
+          <w:p>
+            <w:r>
+              <w:rPr>
+                <w:sz w:val="16"/>
+              </w:rPr>
+            </w:r>
+          </w:p>
         </w:tc>
         <w:tc>
           <w:tcPr>
             <w:tcW w:w="792" w:type="dxa"/>
           </w:tcPr>
-          <w:p/>
+          <w:p>
+            <w:r>
+              <w:rPr>
+                <w:sz w:val="16"/>
+              </w:rPr>
+              <w:t>6</w:t>
+            </w:r>
+          </w:p>
         </w:tc>
         <w:tc>
           <w:tcPr>
             <w:tcW w:w="993" w:type="dxa"/>
           </w:tcPr>
-          <w:p/>
+          <w:p>
+            <w:r>
+              <w:rPr>
+                <w:sz w:val="16"/>
+              </w:rPr>
+            </w:r>
+          </w:p>
         </w:tc>
       </w:tr>
       <w:tr>
@@ -3337,67 +3681,141 @@
           <w:tcPr>
             <w:tcW w:w="1042" w:type="dxa"/>
           </w:tcPr>
-          <w:p/>
+          <w:p>
+            <w:r>
+              <w:rPr>
+                <w:sz w:val="16"/>
+              </w:rPr>
+              <w:t>FS-HU-02</w:t>
+            </w:r>
+          </w:p>
         </w:tc>
         <w:tc>
           <w:tcPr>
             <w:tcW w:w="1756" w:type="dxa"/>
           </w:tcPr>
-          <w:p/>
+          <w:p>
+            <w:r>
+              <w:rPr>
+                <w:sz w:val="16"/>
+              </w:rPr>
+              <w:t>Crear las tablas roles, usuarios y perfiles_usuario (migración Prisma)</w:t>
+            </w:r>
+          </w:p>
         </w:tc>
         <w:tc>
           <w:tcPr>
             <w:tcW w:w="1275" w:type="dxa"/>
           </w:tcPr>
-          <w:p/>
+          <w:p>
+            <w:r>
+              <w:rPr>
+                <w:sz w:val="16"/>
+              </w:rPr>
+              <w:t>4</w:t>
+            </w:r>
+          </w:p>
         </w:tc>
         <w:tc>
           <w:tcPr>
             <w:tcW w:w="1560" w:type="dxa"/>
           </w:tcPr>
-          <w:p/>
+          <w:p>
+            <w:r>
+              <w:rPr>
+                <w:sz w:val="16"/>
+              </w:rPr>
+              <w:t>Luis Méndez</w:t>
+            </w:r>
+          </w:p>
         </w:tc>
         <w:tc>
           <w:tcPr>
             <w:tcW w:w="567" w:type="dxa"/>
           </w:tcPr>
-          <w:p/>
+          <w:p>
+            <w:r>
+              <w:rPr>
+                <w:sz w:val="16"/>
+              </w:rPr>
+              <w:t>2</w:t>
+            </w:r>
+          </w:p>
         </w:tc>
         <w:tc>
           <w:tcPr>
             <w:tcW w:w="567" w:type="dxa"/>
           </w:tcPr>
-          <w:p/>
+          <w:p>
+            <w:r>
+              <w:rPr>
+                <w:sz w:val="16"/>
+              </w:rPr>
+              <w:t>-</w:t>
+            </w:r>
+          </w:p>
         </w:tc>
         <w:tc>
           <w:tcPr>
             <w:tcW w:w="425" w:type="dxa"/>
           </w:tcPr>
-          <w:p/>
+          <w:p>
+            <w:r>
+              <w:rPr>
+                <w:sz w:val="16"/>
+              </w:rPr>
+              <w:t>2</w:t>
+            </w:r>
+          </w:p>
         </w:tc>
         <w:tc>
           <w:tcPr>
             <w:tcW w:w="425" w:type="dxa"/>
           </w:tcPr>
-          <w:p/>
+          <w:p>
+            <w:r>
+              <w:rPr>
+                <w:sz w:val="16"/>
+              </w:rPr>
+            </w:r>
+          </w:p>
         </w:tc>
         <w:tc>
           <w:tcPr>
             <w:tcW w:w="425" w:type="dxa"/>
           </w:tcPr>
-          <w:p/>
+          <w:p>
+            <w:r>
+              <w:rPr>
+                <w:sz w:val="16"/>
+              </w:rPr>
+            </w:r>
+          </w:p>
         </w:tc>
         <w:tc>
           <w:tcPr>
             <w:tcW w:w="792" w:type="dxa"/>
           </w:tcPr>
-          <w:p/>
+          <w:p>
+            <w:r>
+              <w:rPr>
+                <w:sz w:val="16"/>
+              </w:rPr>
+              <w:t>4</w:t>
+            </w:r>
+          </w:p>
         </w:tc>
         <w:tc>
           <w:tcPr>
             <w:tcW w:w="993" w:type="dxa"/>
           </w:tcPr>
-          <w:p/>
+          <w:p>
+            <w:r>
+              <w:rPr>
+                <w:sz w:val="16"/>
+              </w:rPr>
+            </w:r>
+          </w:p>
         </w:tc>
       </w:tr>
       <w:tr>
@@ -3405,67 +3823,141 @@
           <w:tcPr>
             <w:tcW w:w="1042" w:type="dxa"/>
           </w:tcPr>
-          <w:p/>
+          <w:p>
+            <w:r>
+              <w:rPr>
+                <w:sz w:val="16"/>
+              </w:rPr>
+              <w:t>FS-HU-02</w:t>
+            </w:r>
+          </w:p>
         </w:tc>
         <w:tc>
           <w:tcPr>
             <w:tcW w:w="1756" w:type="dxa"/>
           </w:tcPr>
-          <w:p/>
+          <w:p>
+            <w:r>
+              <w:rPr>
+                <w:sz w:val="16"/>
+              </w:rPr>
+              <w:t>Construir el formulario de datos básicos del perfil (Frontend)</w:t>
+            </w:r>
+          </w:p>
         </w:tc>
         <w:tc>
           <w:tcPr>
             <w:tcW w:w="1275" w:type="dxa"/>
           </w:tcPr>
-          <w:p/>
+          <w:p>
+            <w:r>
+              <w:rPr>
+                <w:sz w:val="16"/>
+              </w:rPr>
+              <w:t>4</w:t>
+            </w:r>
+          </w:p>
         </w:tc>
         <w:tc>
           <w:tcPr>
             <w:tcW w:w="1560" w:type="dxa"/>
           </w:tcPr>
-          <w:p/>
+          <w:p>
+            <w:r>
+              <w:rPr>
+                <w:sz w:val="16"/>
+              </w:rPr>
+              <w:t>Nicolás Silva</w:t>
+            </w:r>
+          </w:p>
         </w:tc>
         <w:tc>
           <w:tcPr>
             <w:tcW w:w="567" w:type="dxa"/>
           </w:tcPr>
-          <w:p/>
+          <w:p>
+            <w:r>
+              <w:rPr>
+                <w:sz w:val="16"/>
+              </w:rPr>
+              <w:t>2</w:t>
+            </w:r>
+          </w:p>
         </w:tc>
         <w:tc>
           <w:tcPr>
             <w:tcW w:w="567" w:type="dxa"/>
           </w:tcPr>
-          <w:p/>
+          <w:p>
+            <w:r>
+              <w:rPr>
+                <w:sz w:val="16"/>
+              </w:rPr>
+              <w:t>2</w:t>
+            </w:r>
+          </w:p>
         </w:tc>
         <w:tc>
           <w:tcPr>
             <w:tcW w:w="425" w:type="dxa"/>
           </w:tcPr>
-          <w:p/>
+          <w:p>
+            <w:r>
+              <w:rPr>
+                <w:sz w:val="16"/>
+              </w:rPr>
+              <w:t>-</w:t>
+            </w:r>
+          </w:p>
         </w:tc>
         <w:tc>
           <w:tcPr>
             <w:tcW w:w="425" w:type="dxa"/>
           </w:tcPr>
-          <w:p/>
+          <w:p>
+            <w:r>
+              <w:rPr>
+                <w:sz w:val="16"/>
+              </w:rPr>
+            </w:r>
+          </w:p>
         </w:tc>
         <w:tc>
           <w:tcPr>
             <w:tcW w:w="425" w:type="dxa"/>
           </w:tcPr>
-          <w:p/>
+          <w:p>
+            <w:r>
+              <w:rPr>
+                <w:sz w:val="16"/>
+              </w:rPr>
+            </w:r>
+          </w:p>
         </w:tc>
         <w:tc>
           <w:tcPr>
             <w:tcW w:w="792" w:type="dxa"/>
           </w:tcPr>
-          <w:p/>
+          <w:p>
+            <w:r>
+              <w:rPr>
+                <w:sz w:val="16"/>
+              </w:rPr>
+              <w:t>4</w:t>
+            </w:r>
+          </w:p>
         </w:tc>
         <w:tc>
           <w:tcPr>
             <w:tcW w:w="993" w:type="dxa"/>
           </w:tcPr>
-          <w:p/>
+          <w:p>
+            <w:r>
+              <w:rPr>
+                <w:sz w:val="16"/>
+              </w:rPr>
+            </w:r>
+          </w:p>
         </w:tc>
       </w:tr>
       <w:tr>
@@ -3473,70 +3965,601 @@
           <w:tcPr>
             <w:tcW w:w="1042" w:type="dxa"/>
           </w:tcPr>
-          <w:p/>
+          <w:p>
+            <w:r>
+              <w:rPr>
+                <w:sz w:val="16"/>
+              </w:rPr>
+              <w:t>FS-HU-02</w:t>
+            </w:r>
+          </w:p>
         </w:tc>
         <w:tc>
           <w:tcPr>
             <w:tcW w:w="1756" w:type="dxa"/>
           </w:tcPr>
-          <w:p/>
+          <w:p>
+            <w:r>
+              <w:rPr>
+                <w:sz w:val="16"/>
+              </w:rPr>
+              <w:t>Documentar las instrucciones de instalación en el README</w:t>
+            </w:r>
+          </w:p>
         </w:tc>
         <w:tc>
           <w:tcPr>
             <w:tcW w:w="1275" w:type="dxa"/>
           </w:tcPr>
-          <w:p/>
+          <w:p>
+            <w:r>
+              <w:rPr>
+                <w:sz w:val="16"/>
+              </w:rPr>
+              <w:t>2</w:t>
+            </w:r>
+          </w:p>
         </w:tc>
         <w:tc>
           <w:tcPr>
             <w:tcW w:w="1560" w:type="dxa"/>
           </w:tcPr>
-          <w:p/>
+          <w:p>
+            <w:r>
+              <w:rPr>
+                <w:sz w:val="16"/>
+              </w:rPr>
+              <w:t>Rodrigo Cárcamo Rojas</w:t>
+            </w:r>
+          </w:p>
         </w:tc>
         <w:tc>
           <w:tcPr>
             <w:tcW w:w="567" w:type="dxa"/>
           </w:tcPr>
-          <w:p/>
+          <w:p>
+            <w:r>
+              <w:rPr>
+                <w:sz w:val="16"/>
+              </w:rPr>
+              <w:t>1</w:t>
+            </w:r>
+          </w:p>
         </w:tc>
         <w:tc>
           <w:tcPr>
             <w:tcW w:w="567" w:type="dxa"/>
           </w:tcPr>
-          <w:p/>
+          <w:p>
+            <w:r>
+              <w:rPr>
+                <w:sz w:val="16"/>
+              </w:rPr>
+              <w:t>-</w:t>
+            </w:r>
+          </w:p>
         </w:tc>
         <w:tc>
           <w:tcPr>
             <w:tcW w:w="425" w:type="dxa"/>
           </w:tcPr>
-          <w:p/>
+          <w:p>
+            <w:r>
+              <w:rPr>
+                <w:sz w:val="16"/>
+              </w:rPr>
+              <w:t>1</w:t>
+            </w:r>
+          </w:p>
         </w:tc>
         <w:tc>
           <w:tcPr>
             <w:tcW w:w="425" w:type="dxa"/>
           </w:tcPr>
-          <w:p/>
+          <w:p>
+            <w:r>
+              <w:rPr>
+                <w:sz w:val="16"/>
+              </w:rPr>
+            </w:r>
+          </w:p>
         </w:tc>
         <w:tc>
           <w:tcPr>
             <w:tcW w:w="425" w:type="dxa"/>
           </w:tcPr>
-          <w:p/>
+          <w:p>
+            <w:r>
+              <w:rPr>
+                <w:sz w:val="16"/>
+              </w:rPr>
+            </w:r>
+          </w:p>
         </w:tc>
         <w:tc>
           <w:tcPr>
             <w:tcW w:w="792" w:type="dxa"/>
           </w:tcPr>
-          <w:p/>
+          <w:p>
+            <w:r>
+              <w:rPr>
+                <w:sz w:val="16"/>
+              </w:rPr>
+              <w:t>2</w:t>
+            </w:r>
+          </w:p>
         </w:tc>
         <w:tc>
           <w:tcPr>
             <w:tcW w:w="993" w:type="dxa"/>
           </w:tcPr>
-          <w:p/>
+          <w:p>
+            <w:r>
+              <w:rPr>
+                <w:sz w:val="16"/>
+              </w:rPr>
+            </w:r>
+          </w:p>
+        </w:tc>
+      </w:tr>
+      <w:tr>
+        <w:tc>
+          <w:tcPr>
+            <w:tcW w:w="1042" w:type="dxa"/>
+          </w:tcPr>
+          <w:p>
+            <w:r>
+              <w:rPr>
+                <w:rFonts w:ascii="Calibri" w:hAnsi="Calibri"/>
+                <w:i/>
+                <w:color w:val="545454"/>
+                <w:sz w:val="16"/>
+              </w:rPr>
+              <w:t xml:space="preserve">FS-HU-02</w:t>
+            </w:r>
+          </w:p>
+        </w:tc>
+        <w:tc>
+          <w:tcPr>
+            <w:tcW w:w="1756" w:type="dxa"/>
+          </w:tcPr>
+          <w:p>
+            <w:r>
+              <w:rPr>
+                <w:sz w:val="16"/>
+              </w:rPr>
+              <w:t>Implementar los endpoints de consulta y actualización del perfil</w:t>
+            </w:r>
+          </w:p>
+        </w:tc>
+        <w:tc>
+          <w:tcPr>
+            <w:tcW w:w="1275" w:type="dxa"/>
+          </w:tcPr>
+          <w:p>
+            <w:r>
+              <w:rPr>
+                <w:sz w:val="16"/>
+              </w:rPr>
+              <w:t>3</w:t>
+            </w:r>
+          </w:p>
+        </w:tc>
+        <w:tc>
+          <w:tcPr>
+            <w:tcW w:w="1560" w:type="dxa"/>
+          </w:tcPr>
+          <w:p>
+            <w:r>
+              <w:rPr>
+                <w:sz w:val="16"/>
+              </w:rPr>
+              <w:t>Rodrigo Cárcamo Rojas</w:t>
+            </w:r>
+          </w:p>
+        </w:tc>
+        <w:tc>
+          <w:tcPr>
+            <w:tcW w:w="567" w:type="dxa"/>
+          </w:tcPr>
+          <w:p>
+            <w:r>
+              <w:rPr>
+                <w:sz w:val="16"/>
+              </w:rPr>
+              <w:t>2</w:t>
+            </w:r>
+          </w:p>
+        </w:tc>
+        <w:tc>
+          <w:tcPr>
+            <w:tcW w:w="567" w:type="dxa"/>
+          </w:tcPr>
+          <w:p>
+            <w:r>
+              <w:rPr>
+                <w:sz w:val="16"/>
+              </w:rPr>
+              <w:t>1</w:t>
+            </w:r>
+          </w:p>
+        </w:tc>
+        <w:tc>
+          <w:tcPr>
+            <w:tcW w:w="425" w:type="dxa"/>
+          </w:tcPr>
+          <w:p>
+            <w:r>
+              <w:rPr>
+                <w:sz w:val="16"/>
+              </w:rPr>
+              <w:t>-</w:t>
+            </w:r>
+          </w:p>
+        </w:tc>
+        <w:tc>
+          <w:tcPr>
+            <w:tcW w:w="425" w:type="dxa"/>
+          </w:tcPr>
+          <w:p>
+            <w:r>
+              <w:rPr>
+                <w:sz w:val="16"/>
+              </w:rPr>
+            </w:r>
+          </w:p>
+        </w:tc>
+        <w:tc>
+          <w:tcPr>
+            <w:tcW w:w="425" w:type="dxa"/>
+          </w:tcPr>
+          <w:p>
+            <w:r>
+              <w:rPr>
+                <w:sz w:val="16"/>
+              </w:rPr>
+            </w:r>
+          </w:p>
+        </w:tc>
+        <w:tc>
+          <w:tcPr>
+            <w:tcW w:w="792" w:type="dxa"/>
+          </w:tcPr>
+          <w:p>
+            <w:r>
+              <w:rPr>
+                <w:sz w:val="16"/>
+              </w:rPr>
+              <w:t>3</w:t>
+            </w:r>
+          </w:p>
+        </w:tc>
+        <w:tc>
+          <w:tcPr>
+            <w:tcW w:w="993" w:type="dxa"/>
+          </w:tcPr>
+          <w:p>
+            <w:r>
+              <w:rPr>
+                <w:sz w:val="16"/>
+              </w:rPr>
+            </w:r>
+          </w:p>
+        </w:tc>
+      </w:tr>
+      <w:tr>
+        <w:tc>
+          <w:tcPr>
+            <w:tcW w:w="1042" w:type="dxa"/>
+          </w:tcPr>
+          <w:p>
+            <w:r>
+              <w:rPr>
+                <w:rFonts w:ascii="Calibri" w:hAnsi="Calibri"/>
+                <w:i/>
+                <w:color w:val="545454"/>
+                <w:sz w:val="16"/>
+              </w:rPr>
+              <w:t xml:space="preserve">FS-HU-02</w:t>
+            </w:r>
+          </w:p>
+        </w:tc>
+        <w:tc>
+          <w:tcPr>
+            <w:tcW w:w="1756" w:type="dxa"/>
+          </w:tcPr>
+          <w:p>
+            <w:r>
+              <w:rPr>
+                <w:sz w:val="16"/>
+              </w:rPr>
+              <w:t>Pruebas automatizadas del perfil (backend y Vitest)</w:t>
+            </w:r>
+          </w:p>
+        </w:tc>
+        <w:tc>
+          <w:tcPr>
+            <w:tcW w:w="1275" w:type="dxa"/>
+          </w:tcPr>
+          <w:p>
+            <w:r>
+              <w:rPr>
+                <w:sz w:val="16"/>
+              </w:rPr>
+              <w:t>2</w:t>
+            </w:r>
+          </w:p>
+        </w:tc>
+        <w:tc>
+          <w:tcPr>
+            <w:tcW w:w="1560" w:type="dxa"/>
+          </w:tcPr>
+          <w:p>
+            <w:r>
+              <w:rPr>
+                <w:sz w:val="16"/>
+              </w:rPr>
+              <w:t>Nicolás Silva</w:t>
+            </w:r>
+          </w:p>
+        </w:tc>
+        <w:tc>
+          <w:tcPr>
+            <w:tcW w:w="567" w:type="dxa"/>
+          </w:tcPr>
+          <w:p>
+            <w:r>
+              <w:rPr>
+                <w:sz w:val="16"/>
+              </w:rPr>
+              <w:t>-</w:t>
+            </w:r>
+          </w:p>
+        </w:tc>
+        <w:tc>
+          <w:tcPr>
+            <w:tcW w:w="567" w:type="dxa"/>
+          </w:tcPr>
+          <w:p>
+            <w:r>
+              <w:rPr>
+                <w:sz w:val="16"/>
+              </w:rPr>
+              <w:t>2</w:t>
+            </w:r>
+          </w:p>
+        </w:tc>
+        <w:tc>
+          <w:tcPr>
+            <w:tcW w:w="425" w:type="dxa"/>
+          </w:tcPr>
+          <w:p>
+            <w:r>
+              <w:rPr>
+                <w:sz w:val="16"/>
+              </w:rPr>
+              <w:t>-</w:t>
+            </w:r>
+          </w:p>
+        </w:tc>
+        <w:tc>
+          <w:tcPr>
+            <w:tcW w:w="425" w:type="dxa"/>
+          </w:tcPr>
+          <w:p>
+            <w:r>
+              <w:rPr>
+                <w:sz w:val="16"/>
+              </w:rPr>
+            </w:r>
+          </w:p>
+        </w:tc>
+        <w:tc>
+          <w:tcPr>
+            <w:tcW w:w="425" w:type="dxa"/>
+          </w:tcPr>
+          <w:p>
+            <w:r>
+              <w:rPr>
+                <w:sz w:val="16"/>
+              </w:rPr>
+            </w:r>
+          </w:p>
+        </w:tc>
+        <w:tc>
+          <w:tcPr>
+            <w:tcW w:w="792" w:type="dxa"/>
+          </w:tcPr>
+          <w:p>
+            <w:r>
+              <w:rPr>
+                <w:sz w:val="16"/>
+              </w:rPr>
+              <w:t>2</w:t>
+            </w:r>
+          </w:p>
+        </w:tc>
+        <w:tc>
+          <w:tcPr>
+            <w:tcW w:w="993" w:type="dxa"/>
+          </w:tcPr>
+          <w:p>
+            <w:r>
+              <w:rPr>
+                <w:sz w:val="16"/>
+              </w:rPr>
+            </w:r>
+          </w:p>
+        </w:tc>
+      </w:tr>
+      <w:tr>
+        <w:tc>
+          <w:tcPr>
+            <w:tcW w:w="1042" w:type="dxa"/>
+          </w:tcPr>
+          <w:p>
+            <w:r>
+              <w:rPr>
+                <w:rFonts w:ascii="Calibri" w:hAnsi="Calibri"/>
+                <w:b/>
+                <w:i/>
+                <w:color w:val="545454"/>
+                <w:sz w:val="16"/>
+              </w:rPr>
+              <w:t xml:space="preserve"/>
+            </w:r>
+          </w:p>
+        </w:tc>
+        <w:tc>
+          <w:tcPr>
+            <w:tcW w:w="1756" w:type="dxa"/>
+          </w:tcPr>
+          <w:p>
+            <w:r>
+              <w:rPr>
+                <w:b/>
+                <w:sz w:val="16"/>
+              </w:rPr>
+              <w:t xml:space="preserve">Total</w:t>
+            </w:r>
+          </w:p>
+        </w:tc>
+        <w:tc>
+          <w:tcPr>
+            <w:tcW w:w="1275" w:type="dxa"/>
+          </w:tcPr>
+          <w:p>
+            <w:r>
+              <w:rPr>
+                <w:b/>
+                <w:sz w:val="16"/>
+              </w:rPr>
+              <w:t xml:space="preserve">43</w:t>
+            </w:r>
+          </w:p>
+        </w:tc>
+        <w:tc>
+          <w:tcPr>
+            <w:tcW w:w="1560" w:type="dxa"/>
+          </w:tcPr>
+          <w:p>
+            <w:r>
+              <w:rPr>
+                <w:b/>
+                <w:sz w:val="16"/>
+              </w:rPr>
+              <w:t xml:space="preserve"/>
+            </w:r>
+          </w:p>
+        </w:tc>
+        <w:tc>
+          <w:tcPr>
+            <w:tcW w:w="567" w:type="dxa"/>
+          </w:tcPr>
+          <w:p>
+            <w:r>
+              <w:rPr>
+                <w:b/>
+                <w:sz w:val="16"/>
+              </w:rPr>
+              <w:t xml:space="preserve">12</w:t>
+            </w:r>
+          </w:p>
+        </w:tc>
+        <w:tc>
+          <w:tcPr>
+            <w:tcW w:w="567" w:type="dxa"/>
+          </w:tcPr>
+          <w:p>
+            <w:r>
+              <w:rPr>
+                <w:b/>
+                <w:sz w:val="16"/>
+              </w:rPr>
+              <w:t xml:space="preserve">15</w:t>
+            </w:r>
+          </w:p>
+        </w:tc>
+        <w:tc>
+          <w:tcPr>
+            <w:tcW w:w="425" w:type="dxa"/>
+          </w:tcPr>
+          <w:p>
+            <w:r>
+              <w:rPr>
+                <w:b/>
+                <w:sz w:val="16"/>
+              </w:rPr>
+              <w:t xml:space="preserve">16</w:t>
+            </w:r>
+          </w:p>
+        </w:tc>
+        <w:tc>
+          <w:tcPr>
+            <w:tcW w:w="425" w:type="dxa"/>
+          </w:tcPr>
+          <w:p>
+            <w:r>
+              <w:rPr>
+                <w:b/>
+                <w:sz w:val="16"/>
+              </w:rPr>
+              <w:t xml:space="preserve"/>
+            </w:r>
+          </w:p>
+        </w:tc>
+        <w:tc>
+          <w:tcPr>
+            <w:tcW w:w="425" w:type="dxa"/>
+          </w:tcPr>
+          <w:p>
+            <w:r>
+              <w:rPr>
+                <w:b/>
+                <w:sz w:val="16"/>
+              </w:rPr>
+              <w:t xml:space="preserve"/>
+            </w:r>
+          </w:p>
+        </w:tc>
+        <w:tc>
+          <w:tcPr>
+            <w:tcW w:w="792" w:type="dxa"/>
+          </w:tcPr>
+          <w:p>
+            <w:r>
+              <w:rPr>
+                <w:b/>
+                <w:sz w:val="16"/>
+              </w:rPr>
+              <w:t xml:space="preserve">43</w:t>
+            </w:r>
+          </w:p>
+        </w:tc>
+        <w:tc>
+          <w:tcPr>
+            <w:tcW w:w="993" w:type="dxa"/>
+          </w:tcPr>
+          <w:p>
+            <w:r>
+              <w:rPr>
+                <w:b/>
+                <w:sz w:val="16"/>
+              </w:rPr>
+              <w:t xml:space="preserve"/>
+            </w:r>
+          </w:p>
         </w:tc>
       </w:tr>
     </w:tbl>
+    <w:p>
+      <w:r>
+        <w:rPr>
+          <w:sz w:val="18"/>
+        </w:rPr>
+        <w:t>Las horas se registraron en los días 6, 7 y 8 del sprint (14-09, 15-09 y 20-09 de 2026), completando las 43 horas estimadas: Luis Méndez 15, Rodrigo Cárcamo Rojas 14 y Nicolás Silva 14. La columna Estado (A/R) la completa el Product Owner durante la Sprint Review.</w:t>
+      </w:r>
+    </w:p>
     <w:p/>
     <w:p>
       <w:pPr>
@@ -3576,13 +4599,38 @@
           </w:tcPr>
           <w:p>
             <w:r>
-              <w:rPr>
-                <w:rFonts w:ascii="Calibri" w:hAnsi="Calibri"/>
-                <w:i/>
-                <w:color w:val="545454"/>
-                <w:sz w:val="19"/>
-              </w:rPr>
-              <w:t>[Aquí se insertará el gráfico de avance real del Sprint 1, una vez que el sprint esté en ejecución o finalizado.]</w:t>
+              <w:drawing>
+                <wp:inline xmlns:a="http://schemas.openxmlformats.org/drawingml/2006/main" xmlns:pic="http://schemas.openxmlformats.org/drawingml/2006/picture">
+                  <wp:extent cx="5400000" cy="2835000"/>
+                  <wp:docPr id="1" name="Picture 1"/>
+                  <wp:cNvGraphicFramePr>
+                    <a:graphicFrameLocks noChangeAspect="1"/>
+                  </wp:cNvGraphicFramePr>
+                  <a:graphic>
+                    <a:graphicData uri="http://schemas.openxmlformats.org/drawingml/2006/picture">
+                      <pic:pic>
+                        <pic:nvPicPr>
+                          <pic:cNvPr id="0" name="burndown_sprint1.png"/>
+                          <pic:cNvPicPr/>
+                        </pic:nvPicPr>
+                        <pic:blipFill>
+                          <a:blip r:embed="rId14"/>
+                          <a:stretch>
+                            <a:fillRect/>
+                          </a:stretch>
+                        </pic:blipFill>
+                        <pic:spPr>
+                          <a:xfrm>
+                            <a:off x="0" y="0"/>
+                            <a:ext cx="5400000" cy="2835000"/>
+                          </a:xfrm>
+                          <a:prstGeom prst="rect"/>
+                        </pic:spPr>
+                      </pic:pic>
+                    </a:graphicData>
+                  </a:graphic>
+                </wp:inline>
+              </w:drawing>
             </w:r>
           </w:p>
         </w:tc>
@@ -3721,9 +4769,9 @@
                 <w:rFonts w:ascii="Calibri" w:hAnsi="Calibri"/>
                 <w:i/>
                 <w:color w:val="545454"/>
-                <w:sz w:val="19"/>
-              </w:rPr>
-              <w:t>[Esta tabla se completa al finalizar el Sprint 1, reflejando cómo queda la Pila del Producto tras la revisión con el Product Owner.]</w:t>
+                <w:sz w:val="18"/>
+              </w:rPr>
+              <w:t xml:space="preserve">FS-HU-03</w:t>
             </w:r>
           </w:p>
         </w:tc>
@@ -3731,19 +4779,40 @@
           <w:tcPr>
             <w:tcW w:w="5007" w:type="dxa"/>
           </w:tcPr>
-          <w:p/>
+          <w:p>
+            <w:r>
+              <w:rPr>
+                <w:sz w:val="18"/>
+              </w:rPr>
+              <w:t>Listado de profesionales</w:t>
+            </w:r>
+          </w:p>
         </w:tc>
         <w:tc>
           <w:tcPr>
             <w:tcW w:w="1442" w:type="dxa"/>
           </w:tcPr>
-          <w:p/>
+          <w:p>
+            <w:r>
+              <w:rPr>
+                <w:sz w:val="18"/>
+              </w:rPr>
+              <w:t>5</w:t>
+            </w:r>
+          </w:p>
         </w:tc>
         <w:tc>
           <w:tcPr>
             <w:tcW w:w="1630" w:type="dxa"/>
           </w:tcPr>
-          <w:p/>
+          <w:p>
+            <w:r>
+              <w:rPr>
+                <w:sz w:val="18"/>
+              </w:rPr>
+              <w:t>Alta</w:t>
+            </w:r>
+          </w:p>
         </w:tc>
       </w:tr>
       <w:tr>
@@ -3751,26 +4820,53 @@
           <w:tcPr>
             <w:tcW w:w="749" w:type="dxa"/>
           </w:tcPr>
-          <w:p/>
-          <w:p/>
+          <w:p>
+            <w:r>
+              <w:rPr>
+                <w:sz w:val="18"/>
+              </w:rPr>
+              <w:t>FS-HU-04</w:t>
+            </w:r>
+          </w:p>
         </w:tc>
         <w:tc>
           <w:tcPr>
             <w:tcW w:w="5007" w:type="dxa"/>
           </w:tcPr>
-          <w:p/>
+          <w:p>
+            <w:r>
+              <w:rPr>
+                <w:sz w:val="18"/>
+              </w:rPr>
+              <w:t>Perfil de profesional</w:t>
+            </w:r>
+          </w:p>
         </w:tc>
         <w:tc>
           <w:tcPr>
             <w:tcW w:w="1442" w:type="dxa"/>
           </w:tcPr>
-          <w:p/>
+          <w:p>
+            <w:r>
+              <w:rPr>
+                <w:sz w:val="18"/>
+              </w:rPr>
+              <w:t>5</w:t>
+            </w:r>
+          </w:p>
         </w:tc>
         <w:tc>
           <w:tcPr>
             <w:tcW w:w="1630" w:type="dxa"/>
           </w:tcPr>
-          <w:p/>
+          <w:p>
+            <w:r>
+              <w:rPr>
+                <w:sz w:val="18"/>
+              </w:rPr>
+              <w:t>Alta</w:t>
+            </w:r>
+          </w:p>
         </w:tc>
       </w:tr>
       <w:tr>
@@ -3778,26 +4874,53 @@
           <w:tcPr>
             <w:tcW w:w="749" w:type="dxa"/>
           </w:tcPr>
-          <w:p/>
-          <w:p/>
+          <w:p>
+            <w:r>
+              <w:rPr>
+                <w:sz w:val="18"/>
+              </w:rPr>
+              <w:t>FS-HU-13</w:t>
+            </w:r>
+          </w:p>
         </w:tc>
         <w:tc>
           <w:tcPr>
             <w:tcW w:w="5007" w:type="dxa"/>
           </w:tcPr>
-          <w:p/>
+          <w:p>
+            <w:r>
+              <w:rPr>
+                <w:sz w:val="18"/>
+              </w:rPr>
+              <w:t>Disponibilidad del profesional</w:t>
+            </w:r>
+          </w:p>
         </w:tc>
         <w:tc>
           <w:tcPr>
             <w:tcW w:w="1442" w:type="dxa"/>
           </w:tcPr>
-          <w:p/>
+          <w:p>
+            <w:r>
+              <w:rPr>
+                <w:sz w:val="18"/>
+              </w:rPr>
+              <w:t>5</w:t>
+            </w:r>
+          </w:p>
         </w:tc>
         <w:tc>
           <w:tcPr>
             <w:tcW w:w="1630" w:type="dxa"/>
           </w:tcPr>
-          <w:p/>
+          <w:p>
+            <w:r>
+              <w:rPr>
+                <w:sz w:val="18"/>
+              </w:rPr>
+              <w:t>Alta</w:t>
+            </w:r>
+          </w:p>
         </w:tc>
       </w:tr>
       <w:tr>
@@ -3805,26 +4928,53 @@
           <w:tcPr>
             <w:tcW w:w="749" w:type="dxa"/>
           </w:tcPr>
-          <w:p/>
-          <w:p/>
+          <w:p>
+            <w:r>
+              <w:rPr>
+                <w:sz w:val="18"/>
+              </w:rPr>
+              <w:t>FS-HU-05</w:t>
+            </w:r>
+          </w:p>
         </w:tc>
         <w:tc>
           <w:tcPr>
             <w:tcW w:w="5007" w:type="dxa"/>
           </w:tcPr>
-          <w:p/>
+          <w:p>
+            <w:r>
+              <w:rPr>
+                <w:sz w:val="18"/>
+              </w:rPr>
+              <w:t>Buscar cerca de mí</w:t>
+            </w:r>
+          </w:p>
         </w:tc>
         <w:tc>
           <w:tcPr>
             <w:tcW w:w="1442" w:type="dxa"/>
           </w:tcPr>
-          <w:p/>
+          <w:p>
+            <w:r>
+              <w:rPr>
+                <w:sz w:val="18"/>
+              </w:rPr>
+              <w:t>8</w:t>
+            </w:r>
+          </w:p>
         </w:tc>
         <w:tc>
           <w:tcPr>
             <w:tcW w:w="1630" w:type="dxa"/>
           </w:tcPr>
-          <w:p/>
+          <w:p>
+            <w:r>
+              <w:rPr>
+                <w:sz w:val="18"/>
+              </w:rPr>
+              <w:t>Alta</w:t>
+            </w:r>
+          </w:p>
         </w:tc>
       </w:tr>
       <w:tr>
@@ -3832,26 +4982,53 @@
           <w:tcPr>
             <w:tcW w:w="749" w:type="dxa"/>
           </w:tcPr>
-          <w:p/>
-          <w:p/>
+          <w:p>
+            <w:r>
+              <w:rPr>
+                <w:sz w:val="18"/>
+              </w:rPr>
+              <w:t>FS-HU-06</w:t>
+            </w:r>
+          </w:p>
         </w:tc>
         <w:tc>
           <w:tcPr>
             <w:tcW w:w="5007" w:type="dxa"/>
           </w:tcPr>
-          <w:p/>
+          <w:p>
+            <w:r>
+              <w:rPr>
+                <w:sz w:val="18"/>
+              </w:rPr>
+              <w:t>Vista de mapa y lista</w:t>
+            </w:r>
+          </w:p>
         </w:tc>
         <w:tc>
           <w:tcPr>
             <w:tcW w:w="1442" w:type="dxa"/>
           </w:tcPr>
-          <w:p/>
+          <w:p>
+            <w:r>
+              <w:rPr>
+                <w:sz w:val="18"/>
+              </w:rPr>
+              <w:t>5</w:t>
+            </w:r>
+          </w:p>
         </w:tc>
         <w:tc>
           <w:tcPr>
             <w:tcW w:w="1630" w:type="dxa"/>
           </w:tcPr>
-          <w:p/>
+          <w:p>
+            <w:r>
+              <w:rPr>
+                <w:sz w:val="18"/>
+              </w:rPr>
+              <w:t>Media</w:t>
+            </w:r>
+          </w:p>
         </w:tc>
       </w:tr>
       <w:tr>
@@ -3859,26 +5036,53 @@
           <w:tcPr>
             <w:tcW w:w="749" w:type="dxa"/>
           </w:tcPr>
-          <w:p/>
-          <w:p/>
+          <w:p>
+            <w:r>
+              <w:rPr>
+                <w:sz w:val="18"/>
+              </w:rPr>
+              <w:t>FS-HU-14</w:t>
+            </w:r>
+          </w:p>
         </w:tc>
         <w:tc>
           <w:tcPr>
             <w:tcW w:w="5007" w:type="dxa"/>
           </w:tcPr>
-          <w:p/>
+          <w:p>
+            <w:r>
+              <w:rPr>
+                <w:sz w:val="18"/>
+              </w:rPr>
+              <w:t>Reservar hora</w:t>
+            </w:r>
+          </w:p>
         </w:tc>
         <w:tc>
           <w:tcPr>
             <w:tcW w:w="1442" w:type="dxa"/>
           </w:tcPr>
-          <w:p/>
+          <w:p>
+            <w:r>
+              <w:rPr>
+                <w:sz w:val="18"/>
+              </w:rPr>
+              <w:t>8</w:t>
+            </w:r>
+          </w:p>
         </w:tc>
         <w:tc>
           <w:tcPr>
             <w:tcW w:w="1630" w:type="dxa"/>
           </w:tcPr>
-          <w:p/>
+          <w:p>
+            <w:r>
+              <w:rPr>
+                <w:sz w:val="18"/>
+              </w:rPr>
+              <w:t>Alta</w:t>
+            </w:r>
+          </w:p>
         </w:tc>
       </w:tr>
       <w:tr>
@@ -3886,29 +5090,349 @@
           <w:tcPr>
             <w:tcW w:w="749" w:type="dxa"/>
           </w:tcPr>
-          <w:p/>
-          <w:p/>
+          <w:p>
+            <w:r>
+              <w:rPr>
+                <w:sz w:val="18"/>
+              </w:rPr>
+              <w:t>FS-HU-07</w:t>
+            </w:r>
+          </w:p>
         </w:tc>
         <w:tc>
           <w:tcPr>
             <w:tcW w:w="5007" w:type="dxa"/>
           </w:tcPr>
-          <w:p/>
+          <w:p>
+            <w:r>
+              <w:rPr>
+                <w:sz w:val="18"/>
+              </w:rPr>
+              <w:t>Chat de orientación</w:t>
+            </w:r>
+          </w:p>
         </w:tc>
         <w:tc>
           <w:tcPr>
             <w:tcW w:w="1442" w:type="dxa"/>
           </w:tcPr>
-          <w:p/>
+          <w:p>
+            <w:r>
+              <w:rPr>
+                <w:sz w:val="18"/>
+              </w:rPr>
+              <w:t>8</w:t>
+            </w:r>
+          </w:p>
         </w:tc>
         <w:tc>
           <w:tcPr>
             <w:tcW w:w="1630" w:type="dxa"/>
           </w:tcPr>
-          <w:p/>
+          <w:p>
+            <w:r>
+              <w:rPr>
+                <w:sz w:val="18"/>
+              </w:rPr>
+              <w:t>Alta</w:t>
+            </w:r>
+          </w:p>
+        </w:tc>
+      </w:tr>
+      <w:tr>
+        <w:tc>
+          <w:tcPr>
+            <w:tcW w:w="749" w:type="dxa"/>
+          </w:tcPr>
+          <w:p>
+            <w:r>
+              <w:rPr>
+                <w:rFonts w:ascii="Calibri" w:hAnsi="Calibri"/>
+                <w:i/>
+                <w:color w:val="545454"/>
+                <w:sz w:val="18"/>
+              </w:rPr>
+              <w:t xml:space="preserve">FS-HU-08</w:t>
+            </w:r>
+          </w:p>
+        </w:tc>
+        <w:tc>
+          <w:tcPr>
+            <w:tcW w:w="5007" w:type="dxa"/>
+          </w:tcPr>
+          <w:p>
+            <w:r>
+              <w:rPr>
+                <w:sz w:val="18"/>
+              </w:rPr>
+              <w:t>Recomendación de profesional</w:t>
+            </w:r>
+          </w:p>
+        </w:tc>
+        <w:tc>
+          <w:tcPr>
+            <w:tcW w:w="1442" w:type="dxa"/>
+          </w:tcPr>
+          <w:p>
+            <w:r>
+              <w:rPr>
+                <w:sz w:val="18"/>
+              </w:rPr>
+              <w:t>5</w:t>
+            </w:r>
+          </w:p>
+        </w:tc>
+        <w:tc>
+          <w:tcPr>
+            <w:tcW w:w="1630" w:type="dxa"/>
+          </w:tcPr>
+          <w:p>
+            <w:r>
+              <w:rPr>
+                <w:sz w:val="18"/>
+              </w:rPr>
+              <w:t>Media</w:t>
+            </w:r>
+          </w:p>
+        </w:tc>
+      </w:tr>
+      <w:tr>
+        <w:tc>
+          <w:tcPr>
+            <w:tcW w:w="749" w:type="dxa"/>
+          </w:tcPr>
+          <w:p>
+            <w:r>
+              <w:rPr>
+                <w:rFonts w:ascii="Calibri" w:hAnsi="Calibri"/>
+                <w:i/>
+                <w:color w:val="545454"/>
+                <w:sz w:val="18"/>
+              </w:rPr>
+              <w:t xml:space="preserve">FS-HU-09</w:t>
+            </w:r>
+          </w:p>
+        </w:tc>
+        <w:tc>
+          <w:tcPr>
+            <w:tcW w:w="5007" w:type="dxa"/>
+          </w:tcPr>
+          <w:p>
+            <w:r>
+              <w:rPr>
+                <w:sz w:val="18"/>
+              </w:rPr>
+              <w:t>Registro por lenguaje natural</w:t>
+            </w:r>
+          </w:p>
+        </w:tc>
+        <w:tc>
+          <w:tcPr>
+            <w:tcW w:w="1442" w:type="dxa"/>
+          </w:tcPr>
+          <w:p>
+            <w:r>
+              <w:rPr>
+                <w:sz w:val="18"/>
+              </w:rPr>
+              <w:t>8</w:t>
+            </w:r>
+          </w:p>
+        </w:tc>
+        <w:tc>
+          <w:tcPr>
+            <w:tcW w:w="1630" w:type="dxa"/>
+          </w:tcPr>
+          <w:p>
+            <w:r>
+              <w:rPr>
+                <w:sz w:val="18"/>
+              </w:rPr>
+              <w:t>Media</w:t>
+            </w:r>
+          </w:p>
+        </w:tc>
+      </w:tr>
+      <w:tr>
+        <w:tc>
+          <w:tcPr>
+            <w:tcW w:w="749" w:type="dxa"/>
+          </w:tcPr>
+          <w:p>
+            <w:r>
+              <w:rPr>
+                <w:rFonts w:ascii="Calibri" w:hAnsi="Calibri"/>
+                <w:i/>
+                <w:color w:val="545454"/>
+                <w:sz w:val="18"/>
+              </w:rPr>
+              <w:t xml:space="preserve">FS-HU-10</w:t>
+            </w:r>
+          </w:p>
+        </w:tc>
+        <w:tc>
+          <w:tcPr>
+            <w:tcW w:w="5007" w:type="dxa"/>
+          </w:tcPr>
+          <w:p>
+            <w:r>
+              <w:rPr>
+                <w:sz w:val="18"/>
+              </w:rPr>
+              <w:t>Seguimiento de calorías</w:t>
+            </w:r>
+          </w:p>
+        </w:tc>
+        <w:tc>
+          <w:tcPr>
+            <w:tcW w:w="1442" w:type="dxa"/>
+          </w:tcPr>
+          <w:p>
+            <w:r>
+              <w:rPr>
+                <w:sz w:val="18"/>
+              </w:rPr>
+              <w:t>5</w:t>
+            </w:r>
+          </w:p>
+        </w:tc>
+        <w:tc>
+          <w:tcPr>
+            <w:tcW w:w="1630" w:type="dxa"/>
+          </w:tcPr>
+          <w:p>
+            <w:r>
+              <w:rPr>
+                <w:sz w:val="18"/>
+              </w:rPr>
+              <w:t>Media</w:t>
+            </w:r>
+          </w:p>
+        </w:tc>
+      </w:tr>
+      <w:tr>
+        <w:tc>
+          <w:tcPr>
+            <w:tcW w:w="749" w:type="dxa"/>
+          </w:tcPr>
+          <w:p>
+            <w:r>
+              <w:rPr>
+                <w:rFonts w:ascii="Calibri" w:hAnsi="Calibri"/>
+                <w:i/>
+                <w:color w:val="545454"/>
+                <w:sz w:val="18"/>
+              </w:rPr>
+              <w:t xml:space="preserve">FS-HU-11</w:t>
+            </w:r>
+          </w:p>
+        </w:tc>
+        <w:tc>
+          <w:tcPr>
+            <w:tcW w:w="5007" w:type="dxa"/>
+          </w:tcPr>
+          <w:p>
+            <w:r>
+              <w:rPr>
+                <w:sz w:val="18"/>
+              </w:rPr>
+              <w:t>Dockerización</w:t>
+            </w:r>
+          </w:p>
+        </w:tc>
+        <w:tc>
+          <w:tcPr>
+            <w:tcW w:w="1442" w:type="dxa"/>
+          </w:tcPr>
+          <w:p>
+            <w:r>
+              <w:rPr>
+                <w:sz w:val="18"/>
+              </w:rPr>
+              <w:t>3</w:t>
+            </w:r>
+          </w:p>
+        </w:tc>
+        <w:tc>
+          <w:tcPr>
+            <w:tcW w:w="1630" w:type="dxa"/>
+          </w:tcPr>
+          <w:p>
+            <w:r>
+              <w:rPr>
+                <w:sz w:val="18"/>
+              </w:rPr>
+              <w:t>Alta</w:t>
+            </w:r>
+          </w:p>
+        </w:tc>
+      </w:tr>
+      <w:tr>
+        <w:tc>
+          <w:tcPr>
+            <w:tcW w:w="749" w:type="dxa"/>
+          </w:tcPr>
+          <w:p>
+            <w:r>
+              <w:rPr>
+                <w:rFonts w:ascii="Calibri" w:hAnsi="Calibri"/>
+                <w:i/>
+                <w:color w:val="545454"/>
+                <w:sz w:val="18"/>
+              </w:rPr>
+              <w:t xml:space="preserve">FS-HU-12</w:t>
+            </w:r>
+          </w:p>
+        </w:tc>
+        <w:tc>
+          <w:tcPr>
+            <w:tcW w:w="5007" w:type="dxa"/>
+          </w:tcPr>
+          <w:p>
+            <w:r>
+              <w:rPr>
+                <w:sz w:val="18"/>
+              </w:rPr>
+              <w:t>Verificar perfiles profesionales</w:t>
+            </w:r>
+          </w:p>
+        </w:tc>
+        <w:tc>
+          <w:tcPr>
+            <w:tcW w:w="1442" w:type="dxa"/>
+          </w:tcPr>
+          <w:p>
+            <w:r>
+              <w:rPr>
+                <w:sz w:val="18"/>
+              </w:rPr>
+              <w:t>3</w:t>
+            </w:r>
+          </w:p>
+        </w:tc>
+        <w:tc>
+          <w:tcPr>
+            <w:tcW w:w="1630" w:type="dxa"/>
+          </w:tcPr>
+          <w:p>
+            <w:r>
+              <w:rPr>
+                <w:sz w:val="18"/>
+              </w:rPr>
+              <w:t>Baja</w:t>
+            </w:r>
+          </w:p>
         </w:tc>
       </w:tr>
     </w:tbl>
+    <w:p>
+      <w:r>
+        <w:rPr>
+          <w:sz w:val="18"/>
+        </w:rPr>
+        <w:t>FS-HU-01 y FS-HU-02 (8 puntos) salen de la pila al quedar terminadas, sujetas a la aceptación del Product Owner. Quedan 68 puntos pendientes, ordenados según los sprints comprometidos.</w:t>
+      </w:r>
+    </w:p>
     <w:p/>
     <w:p/>
     <w:sectPr>

</xml_diff>

<commit_message>
Cierre del Sprint 1: retrospectiva, aceptacion del PO y revision de codigo aprobada (PR #6)
</commit_message>
<xml_diff>
--- a/FASE 2/Evidencias Proyecto/Evidencias de documentación/Sprint 1/Documento_validando_Sprint_1.docx
+++ b/FASE 2/Evidencias Proyecto/Evidencias de documentación/Sprint 1/Documento_validando_Sprint_1.docx
@@ -262,7 +262,7 @@
           <w:sz w:val="36"/>
           <w:szCs w:val="36"/>
         </w:rPr>
-        <w:t xml:space="preserve">Fecha: 21-09-2026</w:t>
+        <w:t>Fecha: 24-09-2026</w:t>
       </w:r>
       <w:proofErr w:type="spellStart"/>
       <w:proofErr w:type="spellEnd"/>
@@ -1327,6 +1327,9 @@
                 <w:szCs w:val="24"/>
               </w:rPr>
             </w:pPr>
+            <w:r>
+              <w:t>1.2</w:t>
+            </w:r>
           </w:p>
         </w:tc>
         <w:tc>
@@ -1345,6 +1348,9 @@
                 <w:szCs w:val="24"/>
               </w:rPr>
             </w:pPr>
+            <w:r>
+              <w:t>24-09-2026</w:t>
+            </w:r>
           </w:p>
         </w:tc>
         <w:tc>
@@ -1363,6 +1369,9 @@
                 <w:szCs w:val="24"/>
               </w:rPr>
             </w:pPr>
+            <w:r>
+              <w:t>Validación del Product Owner: FS-HU-01 y FS-HU-02 aceptadas (columna A/R) con observaciones</w:t>
+            </w:r>
           </w:p>
         </w:tc>
         <w:tc>
@@ -1381,6 +1390,9 @@
                 <w:szCs w:val="24"/>
               </w:rPr>
             </w:pPr>
+            <w:r>
+              <w:t>Rodrigo Cárcamo Rojas</w:t>
+            </w:r>
           </w:p>
         </w:tc>
       </w:tr>
@@ -2962,6 +2974,7 @@
               <w:rPr>
                 <w:sz w:val="16"/>
               </w:rPr>
+              <w:t>A</w:t>
             </w:r>
           </w:p>
         </w:tc>
@@ -3104,6 +3117,7 @@
               <w:rPr>
                 <w:sz w:val="16"/>
               </w:rPr>
+              <w:t>A</w:t>
             </w:r>
           </w:p>
         </w:tc>
@@ -3246,6 +3260,7 @@
               <w:rPr>
                 <w:sz w:val="16"/>
               </w:rPr>
+              <w:t>A</w:t>
             </w:r>
           </w:p>
         </w:tc>
@@ -3388,6 +3403,7 @@
               <w:rPr>
                 <w:sz w:val="16"/>
               </w:rPr>
+              <w:t>A</w:t>
             </w:r>
           </w:p>
         </w:tc>
@@ -3530,6 +3546,7 @@
               <w:rPr>
                 <w:sz w:val="16"/>
               </w:rPr>
+              <w:t>A</w:t>
             </w:r>
           </w:p>
         </w:tc>
@@ -3672,6 +3689,7 @@
               <w:rPr>
                 <w:sz w:val="16"/>
               </w:rPr>
+              <w:t>A</w:t>
             </w:r>
           </w:p>
         </w:tc>
@@ -3814,6 +3832,7 @@
               <w:rPr>
                 <w:sz w:val="16"/>
               </w:rPr>
+              <w:t>A</w:t>
             </w:r>
           </w:p>
         </w:tc>
@@ -3956,6 +3975,7 @@
               <w:rPr>
                 <w:sz w:val="16"/>
               </w:rPr>
+              <w:t>A</w:t>
             </w:r>
           </w:p>
         </w:tc>
@@ -4098,6 +4118,7 @@
               <w:rPr>
                 <w:sz w:val="16"/>
               </w:rPr>
+              <w:t>A</w:t>
             </w:r>
           </w:p>
         </w:tc>
@@ -4243,6 +4264,7 @@
               <w:rPr>
                 <w:sz w:val="16"/>
               </w:rPr>
+              <w:t>A</w:t>
             </w:r>
           </w:p>
         </w:tc>
@@ -4388,6 +4410,7 @@
               <w:rPr>
                 <w:sz w:val="16"/>
               </w:rPr>
+              <w:t>A</w:t>
             </w:r>
           </w:p>
         </w:tc>
@@ -4557,7 +4580,15 @@
         <w:rPr>
           <w:sz w:val="18"/>
         </w:rPr>
-        <w:t>Las horas se registraron en los días 6, 7 y 8 del sprint (14-09, 15-09 y 20-09 de 2026), completando las 43 horas estimadas: Luis Méndez 15, Rodrigo Cárcamo Rojas 14 y Nicolás Silva 14. La columna Estado (A/R) la completa el Product Owner durante la Sprint Review.</w:t>
+        <w:t>Las horas se registraron en los días 6, 7 y 8 del sprint (14-09, 15-09 y 20-09 de 2026), completando las 43 horas estimadas: Luis Méndez 15, Rodrigo Cárcamo Rojas 14 y Nicolás Silva 14. La columna Estado (A/R) la completa el Product Owner.</w:t>
+      </w:r>
+    </w:p>
+    <w:p>
+      <w:r>
+        <w:rPr>
+          <w:sz w:val="18"/>
+        </w:rPr>
+        <w:t>Validación del Product Owner (24-09-2026): se revisaron los criterios de aceptación de FS-HU-01 (registro exitoso y login con credenciales incorrectas) y FS-HU-02 (completar datos básicos y datos incompletos) contra los casos de prueba CP-001 a CP-007, todos aprobados, y sus evidencias. Ambas historias quedan aceptadas (A). Observaciones del Product Owner: (1) excepción a DoD-03, porque el código del Sprint 1 se integró a la rama principal sin pull request, antes de que el equipo adoptara ese flujo el 22-09-2026; (2) DoD-04: la revisión del código por un integrante distinto del autor se hizo después en GitHub: Luis Méndez aprobó el PR #6 el 24-09-2026, sin observaciones; (3) FS-HU-02 incluye el campo sexo, agregado para cumplir la estimación del requerimiento calórico.</w:t>
       </w:r>
     </w:p>
     <w:p/>
@@ -5430,7 +5461,7 @@
         <w:rPr>
           <w:sz w:val="18"/>
         </w:rPr>
-        <w:t>FS-HU-01 y FS-HU-02 (8 puntos) salen de la pila al quedar terminadas, sujetas a la aceptación del Product Owner. Quedan 68 puntos pendientes, ordenados según los sprints comprometidos.</w:t>
+        <w:t>FS-HU-01 y FS-HU-02 (8 puntos) salen de la pila al quedar terminadas, aceptadas por el Product Owner el 24-09-2026. Quedan 68 puntos pendientes, ordenados según los sprints comprometidos.</w:t>
       </w:r>
     </w:p>
     <w:p/>

</xml_diff>